<commit_message>
fix(studio): bare layout for /studio (site header hid the Studio toolbar); chore: weekly calendar import via GitHub Actions, docs update
Co-Authored-By: Claude Fable 5.1 <noreply@anthropic.com>
</commit_message>
<xml_diff>
--- a/docs/zkortu-dokumentacja-techniczna.docx
+++ b/docs/zkortu-dokumentacja-techniczna.docx
@@ -2696,6 +2696,29 @@
           <w:sz w:val="21"/>
           <w:szCs w:val="21"/>
         </w:rPr>
+        <w:t xml:space="preserve">Automatyzacja. </w:t>
+      </w:r>
+      <w:r>
+        <w:rPr>
+          <w:rFonts w:ascii="Calibri" w:cs="Calibri" w:eastAsia="Calibri" w:hAnsi="Calibri"/>
+          <w:sz w:val="21"/>
+          <w:szCs w:val="21"/>
+        </w:rPr>
+        <w:t xml:space="preserve">Importer uruchamia się co poniedziałek przez GitHub Actions (plik .github/workflows/import-calendar.yml), a w grudniu dodatkowo zasila kolejny sezon; można go też uruchomić ręcznie z zakładki Actions. Wymaga sekretów repozytorium API_TENNIS_KEY i SANITY_API_TOKEN. Statusy turniejów i mecze nie wymagają importu: status liczy się z dat, a mecze są pobierane z API-Tennis na bieżąco.</w:t>
+      </w:r>
+    </w:p>
+    <w:p>
+      <w:pPr>
+        <w:spacing w:after="120" w:line="300"/>
+      </w:pPr>
+      <w:r>
+        <w:rPr>
+          <w:rFonts w:ascii="Calibri" w:cs="Calibri" w:eastAsia="Calibri" w:hAnsi="Calibri"/>
+          <w:b/>
+          <w:bCs/>
+          <w:sz w:val="21"/>
+          <w:szCs w:val="21"/>
+        </w:rPr>
         <w:t xml:space="preserve">Dopasowanie do API-Tennis. </w:t>
       </w:r>
       <w:r>
@@ -5143,7 +5166,25 @@
           <w:sz w:val="21"/>
           <w:szCs w:val="21"/>
         </w:rPr>
-        <w:t xml:space="preserve">Zasilenie kalendarza: npx tsx scripts/import-calendar.ts --year=2026 --dry-run (podgląd), bez --dry-run zapis, --update-dates nadpisuje daty istniejących dokumentów.</w:t>
+        <w:t xml:space="preserve">Zasilenie kalendarza: automatycznie co tydzień (GitHub Actions) lub ręcznie: npx tsx scripts/import-calendar.ts --year=2026 --dry-run (podgląd), bez --dry-run zapis, --update-dates nadpisuje daty istniejących dokumentów.</w:t>
+      </w:r>
+    </w:p>
+    <w:p>
+      <w:pPr>
+        <w:pStyle w:val="ListParagraph"/>
+        <w:numPr>
+          <w:ilvl w:val="0"/>
+          <w:numId w:val="2"/>
+        </w:numPr>
+        <w:spacing w:after="60" w:line="290"/>
+      </w:pPr>
+      <w:r>
+        <w:rPr>
+          <w:rFonts w:ascii="Calibri" w:cs="Calibri" w:eastAsia="Calibri" w:hAnsi="Calibri"/>
+          <w:sz w:val="21"/>
+          <w:szCs w:val="21"/>
+        </w:rPr>
+        <w:t xml:space="preserve">Panel redakcji /studio ma własny układ bez nagłówka i stopki serwisu; aktualizuje się z każdym wdrożeniem.</w:t>
       </w:r>
     </w:p>
     <w:p>

</xml_diff>